<commit_message>
#Se crea UC de consultar venta
</commit_message>
<xml_diff>
--- a/Descripcion-UC/Descripcion-UC005.docx
+++ b/Descripcion-UC/Descripcion-UC005.docx
@@ -47,16 +47,25 @@
               <w:widowControl w:val="0"/>
               <w:spacing w:after="0"/>
               <w:rPr>
-                <w:rFonts w:hint="default"/>
+                <w:rFonts w:hint="default" w:ascii="Calibri" w:hAnsi="Calibri" w:cs="Calibri"/>
+                <w:sz w:val="21"/>
+                <w:szCs w:val="21"/>
                 <w:lang w:val="es-MX"/>
               </w:rPr>
             </w:pPr>
             <w:r>
+              <w:rPr>
+                <w:rFonts w:hint="default" w:ascii="Calibri" w:hAnsi="Calibri" w:cs="Calibri"/>
+                <w:sz w:val="21"/>
+                <w:szCs w:val="21"/>
+              </w:rPr>
               <w:t xml:space="preserve">Nombre del Use Case: </w:t>
             </w:r>
             <w:r>
               <w:rPr>
-                <w:rFonts w:hint="default"/>
+                <w:rFonts w:hint="default" w:ascii="Calibri" w:hAnsi="Calibri" w:cs="Calibri"/>
+                <w:sz w:val="21"/>
+                <w:szCs w:val="21"/>
                 <w:lang w:val="es-MX"/>
               </w:rPr>
               <w:t>Consultar venta</w:t>
@@ -78,17 +87,26 @@
               <w:widowControl w:val="0"/>
               <w:spacing w:after="0"/>
               <w:rPr>
-                <w:rFonts w:hint="default"/>
+                <w:rFonts w:hint="default" w:ascii="Calibri" w:hAnsi="Calibri" w:cs="Calibri"/>
+                <w:sz w:val="21"/>
+                <w:szCs w:val="21"/>
                 <w:u w:val="single"/>
                 <w:lang w:val="es-MX"/>
               </w:rPr>
             </w:pPr>
             <w:r>
+              <w:rPr>
+                <w:rFonts w:hint="default" w:ascii="Calibri" w:hAnsi="Calibri" w:cs="Calibri"/>
+                <w:sz w:val="21"/>
+                <w:szCs w:val="21"/>
+              </w:rPr>
               <w:t>Nº de orden: UC-00</w:t>
             </w:r>
             <w:r>
               <w:rPr>
-                <w:rFonts w:hint="default"/>
+                <w:rFonts w:hint="default" w:ascii="Calibri" w:hAnsi="Calibri" w:cs="Calibri"/>
+                <w:sz w:val="21"/>
+                <w:szCs w:val="21"/>
                 <w:lang w:val="es-MX"/>
               </w:rPr>
               <w:t>5</w:t>
@@ -120,8 +138,94 @@
             <w:pPr>
               <w:widowControl w:val="0"/>
               <w:spacing w:after="0"/>
-            </w:pPr>
-            <w:r>
+              <w:rPr>
+                <w:rFonts w:hint="default" w:ascii="Calibri" w:hAnsi="Calibri" w:cs="Calibri"/>
+                <w:sz w:val="21"/>
+                <w:szCs w:val="21"/>
+              </w:rPr>
+            </w:pPr>
+            <w:r>
+              <w:rPr>
+                <w:rFonts w:hint="default" w:ascii="Calibri" w:hAnsi="Calibri" w:cs="Calibri"/>
+                <w:sz w:val="21"/>
+                <w:szCs w:val="21"/>
+              </w:rPr>
+              <mc:AlternateContent>
+                <mc:Choice Requires="wps">
+                  <w:drawing>
+                    <wp:anchor distT="6350" distB="6350" distL="6350" distR="6350" simplePos="0" relativeHeight="251659264" behindDoc="0" locked="0" layoutInCell="1" allowOverlap="1">
+                      <wp:simplePos x="0" y="0"/>
+                      <wp:positionH relativeFrom="column">
+                        <wp:posOffset>2077085</wp:posOffset>
+                      </wp:positionH>
+                      <wp:positionV relativeFrom="paragraph">
+                        <wp:posOffset>51435</wp:posOffset>
+                      </wp:positionV>
+                      <wp:extent cx="135255" cy="90805"/>
+                      <wp:effectExtent l="6985" t="6985" r="5715" b="5715"/>
+                      <wp:wrapNone/>
+                      <wp:docPr id="2" name="Forma2"/>
+                      <wp:cNvGraphicFramePr/>
+                      <a:graphic xmlns:a="http://schemas.openxmlformats.org/drawingml/2006/main">
+                        <a:graphicData uri="http://schemas.microsoft.com/office/word/2010/wordprocessingShape">
+                          <wps:wsp>
+                            <wps:cNvSpPr/>
+                            <wps:spPr>
+                              <a:xfrm>
+                                <a:off x="0" y="0"/>
+                                <a:ext cx="135255" cy="90805"/>
+                              </a:xfrm>
+                              <a:prstGeom prst="rect">
+                                <a:avLst/>
+                              </a:prstGeom>
+                              <a:solidFill>
+                                <a:srgbClr val="FFFFFF"/>
+                              </a:solidFill>
+                              <a:ln w="12600">
+                                <a:solidFill>
+                                  <a:srgbClr val="000000"/>
+                                </a:solidFill>
+                                <a:prstDash val="dash"/>
+                                <a:round/>
+                              </a:ln>
+                            </wps:spPr>
+                            <wps:style>
+                              <a:lnRef idx="0">
+                                <a:scrgbClr r="0" g="0" b="0"/>
+                              </a:lnRef>
+                              <a:fillRef idx="0">
+                                <a:scrgbClr r="0" g="0" b="0"/>
+                              </a:fillRef>
+                              <a:effectRef idx="0">
+                                <a:scrgbClr r="0" g="0" b="0"/>
+                              </a:effectRef>
+                              <a:fontRef idx="minor"/>
+                            </wps:style>
+                            <wps:bodyPr/>
+                          </wps:wsp>
+                        </a:graphicData>
+                      </a:graphic>
+                    </wp:anchor>
+                  </w:drawing>
+                </mc:Choice>
+                <mc:Fallback>
+                  <w:pict>
+                    <v:rect id="Forma2" o:spid="_x0000_s1026" o:spt="1" style="position:absolute;left:0pt;margin-left:163.55pt;margin-top:4.05pt;height:7.15pt;width:10.65pt;z-index:251659264;mso-width-relative:page;mso-height-relative:page;" fillcolor="#FFFFFF" filled="t" stroked="t" coordsize="21600,21600" o:gfxdata="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">
+                      <v:fill on="t" focussize="0,0"/>
+                      <v:stroke weight="0.992125984251969pt" color="#000000" joinstyle="round" dashstyle="dash"/>
+                      <v:imagedata o:title=""/>
+                      <o:lock v:ext="edit" aspectratio="f"/>
+                    </v:rect>
+                  </w:pict>
+                </mc:Fallback>
+              </mc:AlternateContent>
+            </w:r>
+            <w:r>
+              <w:rPr>
+                <w:rFonts w:hint="default" w:ascii="Calibri" w:hAnsi="Calibri" w:cs="Calibri"/>
+                <w:sz w:val="21"/>
+                <w:szCs w:val="21"/>
+              </w:rPr>
               <w:t>Prioridad                              Alta</w:t>
             </w:r>
           </w:p>
@@ -141,8 +245,106 @@
             <w:pPr>
               <w:widowControl w:val="0"/>
               <w:spacing w:after="0"/>
-            </w:pPr>
-            <w:r>
+              <w:rPr>
+                <w:rFonts w:hint="default" w:ascii="Calibri" w:hAnsi="Calibri" w:cs="Calibri"/>
+                <w:sz w:val="21"/>
+                <w:szCs w:val="21"/>
+              </w:rPr>
+            </w:pPr>
+            <w:r>
+              <w:rPr>
+                <w:rFonts w:hint="default" w:ascii="Calibri" w:hAnsi="Calibri" w:cs="Calibri"/>
+                <w:sz w:val="21"/>
+                <w:szCs w:val="21"/>
+              </w:rPr>
+              <mc:AlternateContent>
+                <mc:Choice Requires="wps">
+                  <w:drawing>
+                    <wp:anchor distT="6350" distB="6350" distL="6350" distR="6350" simplePos="0" relativeHeight="251659264" behindDoc="0" locked="0" layoutInCell="1" allowOverlap="1">
+                      <wp:simplePos x="0" y="0"/>
+                      <wp:positionH relativeFrom="column">
+                        <wp:posOffset>450215</wp:posOffset>
+                      </wp:positionH>
+                      <wp:positionV relativeFrom="paragraph">
+                        <wp:posOffset>51435</wp:posOffset>
+                      </wp:positionV>
+                      <wp:extent cx="135255" cy="89535"/>
+                      <wp:effectExtent l="6985" t="6985" r="5715" b="5715"/>
+                      <wp:wrapNone/>
+                      <wp:docPr id="1" name="Forma1"/>
+                      <wp:cNvGraphicFramePr/>
+                      <a:graphic xmlns:a="http://schemas.openxmlformats.org/drawingml/2006/main">
+                        <a:graphicData uri="http://schemas.microsoft.com/office/word/2010/wordprocessingShape">
+                          <wps:wsp>
+                            <wps:cNvSpPr/>
+                            <wps:spPr>
+                              <a:xfrm>
+                                <a:off x="0" y="0"/>
+                                <a:ext cx="135255" cy="89535"/>
+                              </a:xfrm>
+                              <a:prstGeom prst="rect">
+                                <a:avLst/>
+                              </a:prstGeom>
+                              <a:gradFill rotWithShape="0">
+                                <a:gsLst>
+                                  <a:gs pos="0">
+                                    <a:srgbClr val="666666"/>
+                                  </a:gs>
+                                  <a:gs pos="50000">
+                                    <a:srgbClr val="000000"/>
+                                  </a:gs>
+                                  <a:gs pos="100000">
+                                    <a:srgbClr val="666666"/>
+                                  </a:gs>
+                                </a:gsLst>
+                                <a:lin ang="16200000"/>
+                              </a:gradFill>
+                              <a:ln w="12600">
+                                <a:solidFill>
+                                  <a:srgbClr val="000000"/>
+                                </a:solidFill>
+                                <a:round/>
+                              </a:ln>
+                            </wps:spPr>
+                            <wps:style>
+                              <a:lnRef idx="0">
+                                <a:scrgbClr r="0" g="0" b="0"/>
+                              </a:lnRef>
+                              <a:fillRef idx="0">
+                                <a:scrgbClr r="0" g="0" b="0"/>
+                              </a:fillRef>
+                              <a:effectRef idx="0">
+                                <a:scrgbClr r="0" g="0" b="0"/>
+                              </a:effectRef>
+                              <a:fontRef idx="minor"/>
+                            </wps:style>
+                            <wps:bodyPr/>
+                          </wps:wsp>
+                        </a:graphicData>
+                      </a:graphic>
+                    </wp:anchor>
+                  </w:drawing>
+                </mc:Choice>
+                <mc:Fallback>
+                  <w:pict>
+                    <v:rect id="Forma1" o:spid="_x0000_s1026" o:spt="1" style="position:absolute;left:0pt;margin-left:35.45pt;margin-top:4.05pt;height:7.05pt;width:10.65pt;z-index:251659264;mso-width-relative:page;mso-height-relative:page;" fillcolor="#666666" filled="t" stroked="t" coordsize="21600,21600" o:gfxdata="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">
+                      <v:fill type="gradient" on="t" color2="#000000" angle="180" focus="50%" focussize="0,0">
+                        <o:fill type="gradientUnscaled" v:ext="backwardCompatible"/>
+                      </v:fill>
+                      <v:stroke weight="0.992125984251969pt" color="#000000" joinstyle="round"/>
+                      <v:imagedata o:title=""/>
+                      <o:lock v:ext="edit" aspectratio="f"/>
+                    </v:rect>
+                  </w:pict>
+                </mc:Fallback>
+              </mc:AlternateContent>
+            </w:r>
+            <w:r>
+              <w:rPr>
+                <w:rFonts w:hint="default" w:ascii="Calibri" w:hAnsi="Calibri" w:cs="Calibri"/>
+                <w:sz w:val="21"/>
+                <w:szCs w:val="21"/>
+              </w:rPr>
               <w:t>Media</w:t>
             </w:r>
           </w:p>
@@ -161,8 +363,18 @@
             <w:pPr>
               <w:widowControl w:val="0"/>
               <w:spacing w:after="0"/>
-            </w:pPr>
-            <w:r>
+              <w:rPr>
+                <w:rFonts w:hint="default" w:ascii="Calibri" w:hAnsi="Calibri" w:cs="Calibri"/>
+                <w:sz w:val="21"/>
+                <w:szCs w:val="21"/>
+              </w:rPr>
+            </w:pPr>
+            <w:r>
+              <w:rPr>
+                <w:rFonts w:hint="default" w:ascii="Calibri" w:hAnsi="Calibri" w:cs="Calibri"/>
+                <w:sz w:val="21"/>
+                <w:szCs w:val="21"/>
+              </w:rPr>
               <mc:AlternateContent>
                 <mc:Choice Requires="wps">
                   <w:drawing>
@@ -234,6 +446,11 @@
               </mc:AlternateContent>
             </w:r>
             <w:r>
+              <w:rPr>
+                <w:rFonts w:hint="default" w:ascii="Calibri" w:hAnsi="Calibri" w:cs="Calibri"/>
+                <w:sz w:val="21"/>
+                <w:szCs w:val="21"/>
+              </w:rPr>
               <w:t>Baja</w:t>
             </w:r>
           </w:p>
@@ -263,8 +480,18 @@
             <w:pPr>
               <w:widowControl w:val="0"/>
               <w:spacing w:after="0"/>
-            </w:pPr>
-            <w:r>
+              <w:rPr>
+                <w:rFonts w:hint="default" w:ascii="Calibri" w:hAnsi="Calibri" w:cs="Calibri"/>
+                <w:sz w:val="21"/>
+                <w:szCs w:val="21"/>
+              </w:rPr>
+            </w:pPr>
+            <w:r>
+              <w:rPr>
+                <w:rFonts w:hint="default" w:ascii="Calibri" w:hAnsi="Calibri" w:cs="Calibri"/>
+                <w:sz w:val="21"/>
+                <w:szCs w:val="21"/>
+              </w:rPr>
               <mc:AlternateContent>
                 <mc:Choice Requires="wps">
                   <w:drawing>
@@ -336,6 +563,11 @@
               </mc:AlternateContent>
             </w:r>
             <w:r>
+              <w:rPr>
+                <w:rFonts w:hint="default" w:ascii="Calibri" w:hAnsi="Calibri" w:cs="Calibri"/>
+                <w:sz w:val="21"/>
+                <w:szCs w:val="21"/>
+              </w:rPr>
               <w:t>Complejidad                        Alta</w:t>
             </w:r>
           </w:p>
@@ -355,74 +587,33 @@
             <w:pPr>
               <w:widowControl w:val="0"/>
               <w:spacing w:after="0"/>
-            </w:pPr>
-            <w:r>
-              <w:t>Media</w:t>
-            </w:r>
-          </w:p>
-        </w:tc>
-        <w:tc>
-          <w:tcPr>
-            <w:tcW w:w="3686" w:type="dxa"/>
-            <w:tcBorders>
-              <w:top w:val="single" w:color="000000" w:sz="4" w:space="0"/>
-              <w:left w:val="single" w:color="000000" w:sz="4" w:space="0"/>
-              <w:bottom w:val="single" w:color="000000" w:sz="4" w:space="0"/>
-              <w:right w:val="single" w:color="000000" w:sz="4" w:space="0"/>
-            </w:tcBorders>
-          </w:tcPr>
-          <w:p>
-            <w:pPr>
-              <w:widowControl w:val="0"/>
-              <w:spacing w:after="0"/>
-            </w:pPr>
-            <w:r>
-              <w:t>Baja</w:t>
-            </w:r>
-          </w:p>
-        </w:tc>
-      </w:tr>
-      <w:tr>
-        <w:tblPrEx>
-          <w:tblCellMar>
-            <w:top w:w="0" w:type="dxa"/>
-            <w:left w:w="108" w:type="dxa"/>
-            <w:bottom w:w="0" w:type="dxa"/>
-            <w:right w:w="108" w:type="dxa"/>
-          </w:tblCellMar>
-        </w:tblPrEx>
-        <w:tc>
-          <w:tcPr>
-            <w:tcW w:w="4697" w:type="dxa"/>
-            <w:gridSpan w:val="2"/>
-            <w:tcBorders>
-              <w:top w:val="single" w:color="000000" w:sz="4" w:space="0"/>
-              <w:left w:val="single" w:color="000000" w:sz="4" w:space="0"/>
-              <w:bottom w:val="single" w:color="000000" w:sz="4" w:space="0"/>
-              <w:right w:val="single" w:color="000000" w:sz="4" w:space="0"/>
-            </w:tcBorders>
-          </w:tcPr>
-          <w:p>
-            <w:pPr>
-              <w:widowControl w:val="0"/>
-              <w:spacing w:after="0"/>
-            </w:pPr>
-            <w:r>
+              <w:rPr>
+                <w:rFonts w:hint="default" w:ascii="Calibri" w:hAnsi="Calibri" w:cs="Calibri"/>
+                <w:sz w:val="21"/>
+                <w:szCs w:val="21"/>
+              </w:rPr>
+            </w:pPr>
+            <w:r>
+              <w:rPr>
+                <w:rFonts w:hint="default" w:ascii="Calibri" w:hAnsi="Calibri" w:cs="Calibri"/>
+                <w:sz w:val="21"/>
+                <w:szCs w:val="21"/>
+              </w:rPr>
               <mc:AlternateContent>
                 <mc:Choice Requires="wps">
                   <w:drawing>
                     <wp:anchor distT="6350" distB="6350" distL="6350" distR="6350" simplePos="0" relativeHeight="251659264" behindDoc="0" locked="0" layoutInCell="1" allowOverlap="1">
                       <wp:simplePos x="0" y="0"/>
                       <wp:positionH relativeFrom="column">
-                        <wp:posOffset>2032635</wp:posOffset>
+                        <wp:posOffset>437515</wp:posOffset>
                       </wp:positionH>
                       <wp:positionV relativeFrom="paragraph">
-                        <wp:posOffset>-351790</wp:posOffset>
+                        <wp:posOffset>59690</wp:posOffset>
                       </wp:positionV>
-                      <wp:extent cx="135255" cy="89535"/>
+                      <wp:extent cx="135255" cy="90805"/>
                       <wp:effectExtent l="6985" t="6985" r="5715" b="5715"/>
                       <wp:wrapNone/>
-                      <wp:docPr id="1" name="Forma1"/>
+                      <wp:docPr id="5" name="Forma5"/>
                       <wp:cNvGraphicFramePr/>
                       <a:graphic xmlns:a="http://schemas.openxmlformats.org/drawingml/2006/main">
                         <a:graphicData uri="http://schemas.microsoft.com/office/word/2010/wordprocessingShape">
@@ -431,29 +622,19 @@
                             <wps:spPr>
                               <a:xfrm>
                                 <a:off x="0" y="0"/>
-                                <a:ext cx="135255" cy="89535"/>
+                                <a:ext cx="135255" cy="90805"/>
                               </a:xfrm>
                               <a:prstGeom prst="rect">
                                 <a:avLst/>
                               </a:prstGeom>
-                              <a:gradFill rotWithShape="0">
-                                <a:gsLst>
-                                  <a:gs pos="0">
-                                    <a:srgbClr val="666666"/>
-                                  </a:gs>
-                                  <a:gs pos="50000">
-                                    <a:srgbClr val="000000"/>
-                                  </a:gs>
-                                  <a:gs pos="100000">
-                                    <a:srgbClr val="666666"/>
-                                  </a:gs>
-                                </a:gsLst>
-                                <a:lin ang="16200000"/>
-                              </a:gradFill>
-                              <a:ln w="12600">
+                              <a:solidFill>
+                                <a:srgbClr val="FFFFFF"/>
+                              </a:solidFill>
+                              <a:ln w="12600" cap="rnd">
                                 <a:solidFill>
                                   <a:srgbClr val="000000"/>
                                 </a:solidFill>
+                                <a:prstDash val="dash"/>
                                 <a:round/>
                               </a:ln>
                             </wps:spPr>
@@ -478,11 +659,9 @@
                 </mc:Choice>
                 <mc:Fallback>
                   <w:pict>
-                    <v:rect id="Forma1" o:spid="_x0000_s1026" o:spt="1" style="position:absolute;left:0pt;margin-left:160.05pt;margin-top:-27.7pt;height:7.05pt;width:10.65pt;z-index:251659264;mso-width-relative:page;mso-height-relative:page;" fillcolor="#666666" filled="t" stroked="t" coordsize="21600,21600" o:gfxdata="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">
-                      <v:fill type="gradient" on="t" color2="#000000" angle="180" focus="50%" focussize="0,0">
-                        <o:fill type="gradientUnscaled" v:ext="backwardCompatible"/>
-                      </v:fill>
-                      <v:stroke weight="0.992125984251969pt" color="#000000" joinstyle="round"/>
+                    <v:rect id="Forma5" o:spid="_x0000_s1026" o:spt="1" style="position:absolute;left:0pt;margin-left:34.45pt;margin-top:4.7pt;height:7.15pt;width:10.65pt;z-index:251659264;mso-width-relative:page;mso-height-relative:page;" fillcolor="#FFFFFF" filled="t" stroked="t" coordsize="21600,21600" o:gfxdata="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">
+                      <v:fill on="t" focussize="0,0"/>
+                      <v:stroke weight="0.992125984251969pt" color="#000000" joinstyle="round" dashstyle="dash" endcap="round"/>
                       <v:imagedata o:title=""/>
                       <o:lock v:ext="edit" aspectratio="f"/>
                     </v:rect>
@@ -491,20 +670,18 @@
               </mc:AlternateContent>
             </w:r>
             <w:r>
-              <w:t xml:space="preserve">Actor principal: </w:t>
-            </w:r>
-            <w:r>
-              <w:rPr>
-                <w:rFonts w:hint="default"/>
-              </w:rPr>
-              <w:t>Encargado</w:t>
+              <w:rPr>
+                <w:rFonts w:hint="default" w:ascii="Calibri" w:hAnsi="Calibri" w:cs="Calibri"/>
+                <w:sz w:val="21"/>
+                <w:szCs w:val="21"/>
+              </w:rPr>
+              <w:t>Media</w:t>
             </w:r>
           </w:p>
         </w:tc>
         <w:tc>
           <w:tcPr>
-            <w:tcW w:w="6077" w:type="dxa"/>
-            <w:gridSpan w:val="3"/>
+            <w:tcW w:w="3686" w:type="dxa"/>
             <w:tcBorders>
               <w:top w:val="single" w:color="000000" w:sz="4" w:space="0"/>
               <w:left w:val="single" w:color="000000" w:sz="4" w:space="0"/>
@@ -517,26 +694,32 @@
               <w:widowControl w:val="0"/>
               <w:spacing w:after="0"/>
               <w:rPr>
-                <w:rFonts w:hint="default"/>
-                <w:lang w:val="es-MX"/>
-              </w:rPr>
-            </w:pPr>
-            <w:r>
+                <w:rFonts w:hint="default" w:ascii="Calibri" w:hAnsi="Calibri" w:cs="Calibri"/>
+                <w:sz w:val="21"/>
+                <w:szCs w:val="21"/>
+              </w:rPr>
+            </w:pPr>
+            <w:r>
+              <w:rPr>
+                <w:rFonts w:hint="default" w:ascii="Calibri" w:hAnsi="Calibri" w:cs="Calibri"/>
+                <w:sz w:val="21"/>
+                <w:szCs w:val="21"/>
+              </w:rPr>
               <mc:AlternateContent>
                 <mc:Choice Requires="wps">
                   <w:drawing>
                     <wp:anchor distT="6350" distB="6350" distL="6350" distR="6350" simplePos="0" relativeHeight="251659264" behindDoc="0" locked="0" layoutInCell="1" allowOverlap="1">
                       <wp:simplePos x="0" y="0"/>
                       <wp:positionH relativeFrom="column">
-                        <wp:posOffset>436245</wp:posOffset>
+                        <wp:posOffset>320040</wp:posOffset>
                       </wp:positionH>
                       <wp:positionV relativeFrom="paragraph">
-                        <wp:posOffset>-338455</wp:posOffset>
+                        <wp:posOffset>54610</wp:posOffset>
                       </wp:positionV>
                       <wp:extent cx="135255" cy="90805"/>
                       <wp:effectExtent l="6985" t="6985" r="5715" b="5715"/>
                       <wp:wrapNone/>
-                      <wp:docPr id="2" name="Forma2"/>
+                      <wp:docPr id="6" name="Forma6"/>
                       <wp:cNvGraphicFramePr/>
                       <a:graphic xmlns:a="http://schemas.openxmlformats.org/drawingml/2006/main">
                         <a:graphicData uri="http://schemas.microsoft.com/office/word/2010/wordprocessingShape">
@@ -551,7 +734,7 @@
                                 <a:avLst/>
                               </a:prstGeom>
                               <a:solidFill>
-                                <a:srgbClr val="FFFFFF"/>
+                                <a:srgbClr val="000000"/>
                               </a:solidFill>
                               <a:ln w="12600">
                                 <a:solidFill>
@@ -582,7 +765,7 @@
                 </mc:Choice>
                 <mc:Fallback>
                   <w:pict>
-                    <v:rect id="Forma2" o:spid="_x0000_s1026" o:spt="1" style="position:absolute;left:0pt;margin-left:34.35pt;margin-top:-26.65pt;height:7.15pt;width:10.65pt;z-index:251659264;mso-width-relative:page;mso-height-relative:page;" fillcolor="#FFFFFF" filled="t" stroked="t" coordsize="21600,21600" o:gfxdata="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">
+                    <v:rect id="Forma6" o:spid="_x0000_s1026" o:spt="1" style="position:absolute;left:0pt;margin-left:25.2pt;margin-top:4.3pt;height:7.15pt;width:10.65pt;z-index:251659264;mso-width-relative:page;mso-height-relative:page;" fillcolor="#000000" filled="t" stroked="t" coordsize="21600,21600" o:gfxdata="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">
                       <v:fill on="t" focussize="0,0"/>
                       <v:stroke weight="0.992125984251969pt" color="#000000" joinstyle="round" dashstyle="dash"/>
                       <v:imagedata o:title=""/>
@@ -593,11 +776,101 @@
               </mc:AlternateContent>
             </w:r>
             <w:r>
+              <w:rPr>
+                <w:rFonts w:hint="default" w:ascii="Calibri" w:hAnsi="Calibri" w:cs="Calibri"/>
+                <w:sz w:val="21"/>
+                <w:szCs w:val="21"/>
+              </w:rPr>
+              <w:t>Baja</w:t>
+            </w:r>
+          </w:p>
+        </w:tc>
+      </w:tr>
+      <w:tr>
+        <w:tblPrEx>
+          <w:tblCellMar>
+            <w:top w:w="0" w:type="dxa"/>
+            <w:left w:w="108" w:type="dxa"/>
+            <w:bottom w:w="0" w:type="dxa"/>
+            <w:right w:w="108" w:type="dxa"/>
+          </w:tblCellMar>
+        </w:tblPrEx>
+        <w:tc>
+          <w:tcPr>
+            <w:tcW w:w="4697" w:type="dxa"/>
+            <w:gridSpan w:val="2"/>
+            <w:tcBorders>
+              <w:top w:val="single" w:color="000000" w:sz="4" w:space="0"/>
+              <w:left w:val="single" w:color="000000" w:sz="4" w:space="0"/>
+              <w:bottom w:val="single" w:color="000000" w:sz="4" w:space="0"/>
+              <w:right w:val="single" w:color="000000" w:sz="4" w:space="0"/>
+            </w:tcBorders>
+          </w:tcPr>
+          <w:p>
+            <w:pPr>
+              <w:widowControl w:val="0"/>
+              <w:spacing w:after="0"/>
+              <w:rPr>
+                <w:rFonts w:hint="default" w:ascii="Calibri" w:hAnsi="Calibri" w:cs="Calibri"/>
+                <w:sz w:val="21"/>
+                <w:szCs w:val="21"/>
+                <w:lang w:val="es-MX"/>
+              </w:rPr>
+            </w:pPr>
+            <w:r>
+              <w:rPr>
+                <w:rFonts w:hint="default" w:ascii="Calibri" w:hAnsi="Calibri" w:cs="Calibri"/>
+                <w:sz w:val="21"/>
+                <w:szCs w:val="21"/>
+              </w:rPr>
+              <w:t xml:space="preserve">Actor principal: </w:t>
+            </w:r>
+            <w:r>
+              <w:rPr>
+                <w:rFonts w:hint="default" w:ascii="Calibri" w:hAnsi="Calibri" w:cs="Calibri"/>
+                <w:sz w:val="21"/>
+                <w:szCs w:val="21"/>
+                <w:lang w:val="es-MX"/>
+              </w:rPr>
+              <w:t>Cajero</w:t>
+            </w:r>
+          </w:p>
+        </w:tc>
+        <w:tc>
+          <w:tcPr>
+            <w:tcW w:w="6077" w:type="dxa"/>
+            <w:gridSpan w:val="3"/>
+            <w:tcBorders>
+              <w:top w:val="single" w:color="000000" w:sz="4" w:space="0"/>
+              <w:left w:val="single" w:color="000000" w:sz="4" w:space="0"/>
+              <w:bottom w:val="single" w:color="000000" w:sz="4" w:space="0"/>
+              <w:right w:val="single" w:color="000000" w:sz="4" w:space="0"/>
+            </w:tcBorders>
+          </w:tcPr>
+          <w:p>
+            <w:pPr>
+              <w:widowControl w:val="0"/>
+              <w:spacing w:after="0"/>
+              <w:rPr>
+                <w:rFonts w:hint="default" w:ascii="Calibri" w:hAnsi="Calibri" w:cs="Calibri"/>
+                <w:sz w:val="21"/>
+                <w:szCs w:val="21"/>
+                <w:lang w:val="es-MX"/>
+              </w:rPr>
+            </w:pPr>
+            <w:r>
+              <w:rPr>
+                <w:rFonts w:hint="default" w:ascii="Calibri" w:hAnsi="Calibri" w:cs="Calibri"/>
+                <w:sz w:val="21"/>
+                <w:szCs w:val="21"/>
+              </w:rPr>
               <w:t xml:space="preserve">Actor secundario: </w:t>
             </w:r>
             <w:r>
               <w:rPr>
-                <w:rFonts w:hint="default"/>
+                <w:rFonts w:hint="default" w:ascii="Calibri" w:hAnsi="Calibri" w:cs="Calibri"/>
+                <w:sz w:val="21"/>
+                <w:szCs w:val="21"/>
                 <w:lang w:val="es-MX"/>
               </w:rPr>
               <w:t>-</w:t>
@@ -630,10 +903,18 @@
               <w:widowControl w:val="0"/>
               <w:spacing w:after="0"/>
               <w:rPr>
+                <w:rFonts w:hint="default" w:ascii="Calibri" w:hAnsi="Calibri" w:cs="Calibri"/>
+                <w:sz w:val="21"/>
+                <w:szCs w:val="21"/>
                 <w:u w:val="single"/>
               </w:rPr>
             </w:pPr>
             <w:r>
+              <w:rPr>
+                <w:rFonts w:hint="default" w:ascii="Calibri" w:hAnsi="Calibri" w:cs="Calibri"/>
+                <w:sz w:val="21"/>
+                <w:szCs w:val="21"/>
+              </w:rPr>
               <mc:AlternateContent>
                 <mc:Choice Requires="wps">
                   <w:drawing>
@@ -705,6 +986,11 @@
               </mc:AlternateContent>
             </w:r>
             <w:r>
+              <w:rPr>
+                <w:rFonts w:hint="default" w:ascii="Calibri" w:hAnsi="Calibri" w:cs="Calibri"/>
+                <w:sz w:val="21"/>
+                <w:szCs w:val="21"/>
+              </w:rPr>
               <mc:AlternateContent>
                 <mc:Choice Requires="wps">
                   <w:drawing>
@@ -788,148 +1074,11 @@
               </mc:AlternateContent>
             </w:r>
             <w:r>
-              <mc:AlternateContent>
-                <mc:Choice Requires="wps">
-                  <w:drawing>
-                    <wp:anchor distT="6350" distB="6350" distL="6350" distR="6350" simplePos="0" relativeHeight="251659264" behindDoc="0" locked="0" layoutInCell="1" allowOverlap="1">
-                      <wp:simplePos x="0" y="0"/>
-                      <wp:positionH relativeFrom="column">
-                        <wp:posOffset>3433445</wp:posOffset>
-                      </wp:positionH>
-                      <wp:positionV relativeFrom="paragraph">
-                        <wp:posOffset>-348615</wp:posOffset>
-                      </wp:positionV>
-                      <wp:extent cx="135255" cy="90805"/>
-                      <wp:effectExtent l="6985" t="6985" r="5715" b="5715"/>
-                      <wp:wrapNone/>
-                      <wp:docPr id="6" name="Forma6"/>
-                      <wp:cNvGraphicFramePr/>
-                      <a:graphic xmlns:a="http://schemas.openxmlformats.org/drawingml/2006/main">
-                        <a:graphicData uri="http://schemas.microsoft.com/office/word/2010/wordprocessingShape">
-                          <wps:wsp>
-                            <wps:cNvSpPr/>
-                            <wps:spPr>
-                              <a:xfrm>
-                                <a:off x="0" y="0"/>
-                                <a:ext cx="135255" cy="90805"/>
-                              </a:xfrm>
-                              <a:prstGeom prst="rect">
-                                <a:avLst/>
-                              </a:prstGeom>
-                              <a:solidFill>
-                                <a:srgbClr val="000000"/>
-                              </a:solidFill>
-                              <a:ln w="12600">
-                                <a:solidFill>
-                                  <a:srgbClr val="000000"/>
-                                </a:solidFill>
-                                <a:prstDash val="dash"/>
-                                <a:round/>
-                              </a:ln>
-                            </wps:spPr>
-                            <wps:style>
-                              <a:lnRef idx="0">
-                                <a:scrgbClr r="0" g="0" b="0"/>
-                              </a:lnRef>
-                              <a:fillRef idx="0">
-                                <a:scrgbClr r="0" g="0" b="0"/>
-                              </a:fillRef>
-                              <a:effectRef idx="0">
-                                <a:scrgbClr r="0" g="0" b="0"/>
-                              </a:effectRef>
-                              <a:fontRef idx="minor"/>
-                            </wps:style>
-                            <wps:bodyPr/>
-                          </wps:wsp>
-                        </a:graphicData>
-                      </a:graphic>
-                    </wp:anchor>
-                  </w:drawing>
-                </mc:Choice>
-                <mc:Fallback>
-                  <w:pict>
-                    <v:rect id="Forma6" o:spid="_x0000_s1026" o:spt="1" style="position:absolute;left:0pt;margin-left:270.35pt;margin-top:-27.45pt;height:7.15pt;width:10.65pt;z-index:251659264;mso-width-relative:page;mso-height-relative:page;" fillcolor="#000000" filled="t" stroked="t" coordsize="21600,21600" o:gfxdata="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">
-                      <v:fill on="t" focussize="0,0"/>
-                      <v:stroke weight="0.992125984251969pt" color="#000000" joinstyle="round" dashstyle="dash"/>
-                      <v:imagedata o:title=""/>
-                      <o:lock v:ext="edit" aspectratio="f"/>
-                    </v:rect>
-                  </w:pict>
-                </mc:Fallback>
-              </mc:AlternateContent>
-            </w:r>
-            <w:r>
-              <mc:AlternateContent>
-                <mc:Choice Requires="wps">
-                  <w:drawing>
-                    <wp:anchor distT="6350" distB="6350" distL="6350" distR="6350" simplePos="0" relativeHeight="251659264" behindDoc="0" locked="0" layoutInCell="1" allowOverlap="1">
-                      <wp:simplePos x="0" y="0"/>
-                      <wp:positionH relativeFrom="column">
-                        <wp:posOffset>4905375</wp:posOffset>
-                      </wp:positionH>
-                      <wp:positionV relativeFrom="paragraph">
-                        <wp:posOffset>-356870</wp:posOffset>
-                      </wp:positionV>
-                      <wp:extent cx="135255" cy="90805"/>
-                      <wp:effectExtent l="6985" t="6985" r="5715" b="5715"/>
-                      <wp:wrapNone/>
-                      <wp:docPr id="5" name="Forma5"/>
-                      <wp:cNvGraphicFramePr/>
-                      <a:graphic xmlns:a="http://schemas.openxmlformats.org/drawingml/2006/main">
-                        <a:graphicData uri="http://schemas.microsoft.com/office/word/2010/wordprocessingShape">
-                          <wps:wsp>
-                            <wps:cNvSpPr/>
-                            <wps:spPr>
-                              <a:xfrm>
-                                <a:off x="0" y="0"/>
-                                <a:ext cx="135255" cy="90805"/>
-                              </a:xfrm>
-                              <a:prstGeom prst="rect">
-                                <a:avLst/>
-                              </a:prstGeom>
-                              <a:solidFill>
-                                <a:srgbClr val="FFFFFF"/>
-                              </a:solidFill>
-                              <a:ln w="12600" cap="rnd">
-                                <a:solidFill>
-                                  <a:srgbClr val="000000"/>
-                                </a:solidFill>
-                                <a:prstDash val="dash"/>
-                                <a:round/>
-                              </a:ln>
-                            </wps:spPr>
-                            <wps:style>
-                              <a:lnRef idx="0">
-                                <a:scrgbClr r="0" g="0" b="0"/>
-                              </a:lnRef>
-                              <a:fillRef idx="0">
-                                <a:scrgbClr r="0" g="0" b="0"/>
-                              </a:fillRef>
-                              <a:effectRef idx="0">
-                                <a:scrgbClr r="0" g="0" b="0"/>
-                              </a:effectRef>
-                              <a:fontRef idx="minor"/>
-                            </wps:style>
-                            <wps:bodyPr/>
-                          </wps:wsp>
-                        </a:graphicData>
-                      </a:graphic>
-                    </wp:anchor>
-                  </w:drawing>
-                </mc:Choice>
-                <mc:Fallback>
-                  <w:pict>
-                    <v:rect id="Forma5" o:spid="_x0000_s1026" o:spt="1" style="position:absolute;left:0pt;margin-left:386.25pt;margin-top:-28.1pt;height:7.15pt;width:10.65pt;z-index:251659264;mso-width-relative:page;mso-height-relative:page;" fillcolor="#FFFFFF" filled="t" stroked="t" coordsize="21600,21600" o:gfxdata="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">
-                      <v:fill on="t" focussize="0,0"/>
-                      <v:stroke weight="0.992125984251969pt" color="#000000" joinstyle="round" dashstyle="dash" endcap="round"/>
-                      <v:imagedata o:title=""/>
-                      <o:lock v:ext="edit" aspectratio="f"/>
-                    </v:rect>
-                  </w:pict>
-                </mc:Fallback>
-              </mc:AlternateContent>
-            </w:r>
-            <w:r>
+              <w:rPr>
+                <w:rFonts w:hint="default" w:ascii="Calibri" w:hAnsi="Calibri" w:cs="Calibri"/>
+                <w:sz w:val="21"/>
+                <w:szCs w:val="21"/>
+              </w:rPr>
               <w:t>Tipo de Use Case                  Concreto               Abstracto</w:t>
             </w:r>
           </w:p>
@@ -959,15 +1108,37 @@
             <w:pPr>
               <w:widowControl w:val="0"/>
               <w:spacing w:after="0"/>
-            </w:pPr>
-            <w:r>
+              <w:rPr>
+                <w:rFonts w:hint="default" w:ascii="Calibri" w:hAnsi="Calibri" w:cs="Calibri"/>
+                <w:sz w:val="21"/>
+                <w:szCs w:val="21"/>
+                <w:lang w:val="es-MX"/>
+              </w:rPr>
+            </w:pPr>
+            <w:r>
+              <w:rPr>
+                <w:rFonts w:hint="default" w:ascii="Calibri" w:hAnsi="Calibri" w:cs="Calibri"/>
+                <w:sz w:val="21"/>
+                <w:szCs w:val="21"/>
+              </w:rPr>
               <w:t xml:space="preserve">Objetivo: </w:t>
             </w:r>
             <w:r>
               <w:rPr>
-                <w:rFonts w:hint="default"/>
-              </w:rPr>
-              <w:t>Permitir al encargado gestionar el stock de productos, incluyendo el registro de ingresos, actualización y consulta del stock e histórico.</w:t>
+                <w:rFonts w:hint="default" w:ascii="Calibri" w:hAnsi="Calibri" w:eastAsia="SimSun" w:cs="Calibri"/>
+                <w:sz w:val="21"/>
+                <w:szCs w:val="21"/>
+              </w:rPr>
+              <w:t>Localizar y recuperar información de ventas registradas en el sistema mediante filtros de búsqueda exacta o parcial, permitiendo visualizar comprobantes, montos, clientes asociados y estado de la operación sin comprometer el rendimiento de la aplicación</w:t>
+            </w:r>
+            <w:r>
+              <w:rPr>
+                <w:rFonts w:hint="default" w:ascii="Calibri" w:hAnsi="Calibri" w:eastAsia="SimSun" w:cs="Calibri"/>
+                <w:sz w:val="21"/>
+                <w:szCs w:val="21"/>
+                <w:lang w:val="es-MX"/>
+              </w:rPr>
+              <w:t>.</w:t>
             </w:r>
           </w:p>
         </w:tc>
@@ -996,8 +1167,18 @@
             <w:pPr>
               <w:widowControl w:val="0"/>
               <w:spacing w:after="0"/>
-            </w:pPr>
-            <w:r>
+              <w:rPr>
+                <w:rFonts w:hint="default" w:ascii="Calibri" w:hAnsi="Calibri" w:cs="Calibri"/>
+                <w:sz w:val="21"/>
+                <w:szCs w:val="21"/>
+              </w:rPr>
+            </w:pPr>
+            <w:r>
+              <w:rPr>
+                <w:rFonts w:hint="default" w:ascii="Calibri" w:hAnsi="Calibri" w:cs="Calibri"/>
+                <w:sz w:val="21"/>
+                <w:szCs w:val="21"/>
+              </w:rPr>
               <w:t xml:space="preserve">Precondiciones: </w:t>
             </w:r>
           </w:p>
@@ -1006,28 +1187,54 @@
               <w:widowControl w:val="0"/>
               <w:spacing w:after="0"/>
               <w:rPr>
-                <w:rFonts w:hint="default"/>
-              </w:rPr>
-            </w:pPr>
-            <w:r>
-              <w:rPr>
-                <w:rFonts w:hint="default"/>
+                <w:rFonts w:hint="default" w:ascii="Calibri" w:hAnsi="Calibri" w:cs="Calibri"/>
+                <w:sz w:val="21"/>
+                <w:szCs w:val="21"/>
+              </w:rPr>
+            </w:pPr>
+            <w:r>
+              <w:rPr>
+                <w:rFonts w:hint="default" w:ascii="Calibri" w:hAnsi="Calibri" w:cs="Calibri"/>
+                <w:sz w:val="21"/>
+                <w:szCs w:val="21"/>
               </w:rPr>
               <w:t>- El usuario debe estar autenticado.</w:t>
             </w:r>
-            <w:bookmarkStart w:id="0" w:name="_GoBack"/>
-            <w:bookmarkEnd w:id="0"/>
           </w:p>
           <w:p>
             <w:pPr>
               <w:widowControl w:val="0"/>
               <w:spacing w:after="0"/>
-            </w:pPr>
-            <w:r>
-              <w:rPr>
-                <w:rFonts w:hint="default"/>
-              </w:rPr>
-              <w:t>- El usuario debe tener rol de encargado.</w:t>
+              <w:rPr>
+                <w:rFonts w:hint="default" w:ascii="Calibri" w:hAnsi="Calibri" w:cs="Calibri"/>
+                <w:sz w:val="21"/>
+                <w:szCs w:val="21"/>
+              </w:rPr>
+            </w:pPr>
+            <w:r>
+              <w:rPr>
+                <w:rFonts w:hint="default" w:ascii="Calibri" w:hAnsi="Calibri" w:cs="Calibri"/>
+                <w:sz w:val="21"/>
+                <w:szCs w:val="21"/>
+              </w:rPr>
+              <w:t xml:space="preserve">- El usuario debe tener rol de </w:t>
+            </w:r>
+            <w:r>
+              <w:rPr>
+                <w:rFonts w:hint="default" w:ascii="Calibri" w:hAnsi="Calibri" w:cs="Calibri"/>
+                <w:sz w:val="21"/>
+                <w:szCs w:val="21"/>
+                <w:lang w:val="es-MX"/>
+              </w:rPr>
+              <w:t>cajero</w:t>
+            </w:r>
+            <w:r>
+              <w:rPr>
+                <w:rFonts w:hint="default" w:ascii="Calibri" w:hAnsi="Calibri" w:cs="Calibri"/>
+                <w:sz w:val="21"/>
+                <w:szCs w:val="21"/>
+              </w:rPr>
+              <w:t>.</w:t>
             </w:r>
           </w:p>
         </w:tc>
@@ -1057,8 +1264,18 @@
             <w:pPr>
               <w:widowControl w:val="0"/>
               <w:spacing w:after="0"/>
-            </w:pPr>
-            <w:r>
+              <w:rPr>
+                <w:rFonts w:hint="default" w:ascii="Calibri" w:hAnsi="Calibri" w:cs="Calibri"/>
+                <w:sz w:val="21"/>
+                <w:szCs w:val="21"/>
+              </w:rPr>
+            </w:pPr>
+            <w:r>
+              <w:rPr>
+                <w:rFonts w:hint="default" w:ascii="Calibri" w:hAnsi="Calibri" w:cs="Calibri"/>
+                <w:sz w:val="21"/>
+                <w:szCs w:val="21"/>
+              </w:rPr>
               <w:t>Post- condiciones</w:t>
             </w:r>
           </w:p>
@@ -1078,8 +1295,18 @@
             <w:pPr>
               <w:widowControl w:val="0"/>
               <w:spacing w:after="0"/>
-            </w:pPr>
-            <w:r>
+              <w:rPr>
+                <w:rFonts w:hint="default" w:ascii="Calibri" w:hAnsi="Calibri" w:cs="Calibri"/>
+                <w:sz w:val="21"/>
+                <w:szCs w:val="21"/>
+              </w:rPr>
+            </w:pPr>
+            <w:r>
+              <w:rPr>
+                <w:rFonts w:hint="default" w:ascii="Calibri" w:hAnsi="Calibri" w:cs="Calibri"/>
+                <w:sz w:val="21"/>
+                <w:szCs w:val="21"/>
+              </w:rPr>
               <w:t xml:space="preserve">Éxito: </w:t>
             </w:r>
           </w:p>
@@ -1088,26 +1315,26 @@
               <w:widowControl w:val="0"/>
               <w:spacing w:after="0"/>
               <w:rPr>
-                <w:rFonts w:hint="default"/>
-              </w:rPr>
-            </w:pPr>
-            <w:r>
-              <w:rPr>
-                <w:rFonts w:hint="default"/>
-              </w:rPr>
-              <w:t>- El stock se actualiza correctamente.</w:t>
-            </w:r>
-          </w:p>
-          <w:p>
-            <w:pPr>
-              <w:widowControl w:val="0"/>
-              <w:spacing w:after="0"/>
-            </w:pPr>
-            <w:r>
-              <w:rPr>
-                <w:rFonts w:hint="default"/>
-              </w:rPr>
-              <w:t>- Se registran los movimientos en el histórico.</w:t>
+                <w:rFonts w:hint="default" w:ascii="Calibri" w:hAnsi="Calibri" w:cs="Calibri"/>
+                <w:sz w:val="21"/>
+                <w:szCs w:val="21"/>
+              </w:rPr>
+            </w:pPr>
+            <w:r>
+              <w:rPr>
+                <w:rFonts w:hint="default" w:ascii="Calibri" w:hAnsi="Calibri" w:cs="Calibri"/>
+                <w:sz w:val="21"/>
+                <w:szCs w:val="21"/>
+              </w:rPr>
+              <w:t xml:space="preserve">- </w:t>
+            </w:r>
+            <w:r>
+              <w:rPr>
+                <w:rFonts w:hint="default" w:ascii="Calibri" w:hAnsi="Calibri" w:eastAsia="SimSun" w:cs="Calibri"/>
+                <w:sz w:val="21"/>
+                <w:szCs w:val="21"/>
+              </w:rPr>
+              <w:t>El sistema recupera y expone el conjunto de ventas solicitadas.</w:t>
             </w:r>
           </w:p>
         </w:tc>
@@ -1132,7 +1359,15 @@
               <w:right w:val="single" w:color="000000" w:sz="4" w:space="0"/>
             </w:tcBorders>
           </w:tcPr>
-          <w:p/>
+          <w:p>
+            <w:pPr>
+              <w:rPr>
+                <w:rFonts w:hint="default" w:ascii="Calibri" w:hAnsi="Calibri" w:cs="Calibri"/>
+                <w:sz w:val="21"/>
+                <w:szCs w:val="21"/>
+              </w:rPr>
+            </w:pPr>
+          </w:p>
         </w:tc>
         <w:tc>
           <w:tcPr>
@@ -1149,8 +1384,18 @@
             <w:pPr>
               <w:widowControl w:val="0"/>
               <w:spacing w:after="0"/>
-            </w:pPr>
-            <w:r>
+              <w:rPr>
+                <w:rFonts w:hint="default" w:ascii="Calibri" w:hAnsi="Calibri" w:cs="Calibri"/>
+                <w:sz w:val="21"/>
+                <w:szCs w:val="21"/>
+              </w:rPr>
+            </w:pPr>
+            <w:r>
+              <w:rPr>
+                <w:rFonts w:hint="default" w:ascii="Calibri" w:hAnsi="Calibri" w:cs="Calibri"/>
+                <w:sz w:val="21"/>
+                <w:szCs w:val="21"/>
+              </w:rPr>
               <w:t xml:space="preserve">Fracaso: </w:t>
             </w:r>
           </w:p>
@@ -1159,26 +1404,53 @@
               <w:widowControl w:val="0"/>
               <w:spacing w:after="0"/>
               <w:rPr>
-                <w:rFonts w:hint="default"/>
-              </w:rPr>
-            </w:pPr>
-            <w:r>
-              <w:rPr>
-                <w:rFonts w:hint="default"/>
-              </w:rPr>
-              <w:t>- No se actualiza el stock.</w:t>
-            </w:r>
-          </w:p>
-          <w:p>
-            <w:pPr>
-              <w:widowControl w:val="0"/>
-              <w:spacing w:after="0"/>
-            </w:pPr>
-            <w:r>
-              <w:rPr>
-                <w:rFonts w:hint="default"/>
-              </w:rPr>
-              <w:t>- No se registran los movimientos.</w:t>
+                <w:rFonts w:hint="default" w:ascii="Calibri" w:hAnsi="Calibri" w:cs="Calibri"/>
+                <w:sz w:val="21"/>
+                <w:szCs w:val="21"/>
+                <w:lang w:val="es-MX"/>
+              </w:rPr>
+            </w:pPr>
+            <w:r>
+              <w:rPr>
+                <w:rFonts w:hint="default" w:ascii="Calibri" w:hAnsi="Calibri" w:cs="Calibri"/>
+                <w:sz w:val="21"/>
+                <w:szCs w:val="21"/>
+              </w:rPr>
+              <w:t xml:space="preserve">- </w:t>
+            </w:r>
+            <w:r>
+              <w:rPr>
+                <w:rFonts w:hint="default" w:ascii="Calibri" w:hAnsi="Calibri" w:eastAsia="SimSun" w:cs="Calibri"/>
+                <w:sz w:val="21"/>
+                <w:szCs w:val="21"/>
+              </w:rPr>
+              <w:t xml:space="preserve">No se </w:t>
+            </w:r>
+            <w:r>
+              <w:rPr>
+                <w:rFonts w:hint="default" w:ascii="Calibri" w:hAnsi="Calibri" w:eastAsia="SimSun" w:cs="Calibri"/>
+                <w:sz w:val="21"/>
+                <w:szCs w:val="21"/>
+                <w:lang w:val="es-MX"/>
+              </w:rPr>
+              <w:t xml:space="preserve">recuperan las ventas </w:t>
+            </w:r>
+            <w:r>
+              <w:rPr>
+                <w:rFonts w:hint="default" w:ascii="Calibri" w:hAnsi="Calibri" w:eastAsia="SimSun" w:cs="Calibri"/>
+                <w:sz w:val="21"/>
+                <w:szCs w:val="21"/>
+              </w:rPr>
+              <w:t>del sistem</w:t>
+            </w:r>
+            <w:r>
+              <w:rPr>
+                <w:rFonts w:hint="default" w:ascii="Calibri" w:hAnsi="Calibri" w:eastAsia="SimSun" w:cs="Calibri"/>
+                <w:sz w:val="21"/>
+                <w:szCs w:val="21"/>
+                <w:lang w:val="es-MX"/>
+              </w:rPr>
+              <w:t>a.</w:t>
             </w:r>
           </w:p>
         </w:tc>
@@ -1207,8 +1479,18 @@
             <w:pPr>
               <w:widowControl w:val="0"/>
               <w:spacing w:after="0"/>
-            </w:pPr>
-            <w:r>
+              <w:rPr>
+                <w:rFonts w:hint="default" w:ascii="Calibri" w:hAnsi="Calibri" w:cs="Calibri"/>
+                <w:sz w:val="21"/>
+                <w:szCs w:val="21"/>
+              </w:rPr>
+            </w:pPr>
+            <w:r>
+              <w:rPr>
+                <w:rFonts w:hint="default" w:ascii="Calibri" w:hAnsi="Calibri" w:cs="Calibri"/>
+                <w:sz w:val="21"/>
+                <w:szCs w:val="21"/>
+              </w:rPr>
               <w:t>Curso Normal</w:t>
             </w:r>
           </w:p>
@@ -1228,8 +1510,18 @@
             <w:pPr>
               <w:widowControl w:val="0"/>
               <w:spacing w:after="0"/>
-            </w:pPr>
-            <w:r>
+              <w:rPr>
+                <w:rFonts w:hint="default" w:ascii="Calibri" w:hAnsi="Calibri" w:cs="Calibri"/>
+                <w:sz w:val="21"/>
+                <w:szCs w:val="21"/>
+              </w:rPr>
+            </w:pPr>
+            <w:r>
+              <w:rPr>
+                <w:rFonts w:hint="default" w:ascii="Calibri" w:hAnsi="Calibri" w:cs="Calibri"/>
+                <w:sz w:val="21"/>
+                <w:szCs w:val="21"/>
+              </w:rPr>
               <w:t>Curso Alternativo</w:t>
             </w:r>
           </w:p>
@@ -1262,175 +1554,265 @@
             <w:pPr>
               <w:widowControl w:val="0"/>
               <w:spacing w:after="0" w:line="240" w:lineRule="auto"/>
-            </w:pPr>
+              <w:rPr>
+                <w:rFonts w:hint="default" w:ascii="Calibri" w:hAnsi="Calibri" w:cs="Calibri"/>
+                <w:sz w:val="21"/>
+                <w:szCs w:val="21"/>
+              </w:rPr>
+            </w:pPr>
+          </w:p>
+          <w:p>
+            <w:pPr>
+              <w:keepNext w:val="0"/>
+              <w:keepLines w:val="0"/>
+              <w:widowControl/>
+              <w:numPr>
+                <w:ilvl w:val="0"/>
+                <w:numId w:val="1"/>
+              </w:numPr>
+              <w:suppressLineNumbers w:val="0"/>
+              <w:rPr>
+                <w:rFonts w:hint="default" w:ascii="Calibri" w:hAnsi="Calibri" w:cs="Calibri"/>
+                <w:sz w:val="21"/>
+                <w:szCs w:val="21"/>
+              </w:rPr>
+            </w:pPr>
+            <w:r>
+              <w:rPr>
+                <w:rFonts w:hint="default" w:ascii="Calibri" w:hAnsi="Calibri" w:cs="Calibri"/>
+                <w:sz w:val="21"/>
+                <w:szCs w:val="21"/>
+              </w:rPr>
+              <w:t xml:space="preserve">El actor selecciona la opción "Consultar Venta". </w:t>
+            </w:r>
+            <w:r>
+              <w:rPr>
+                <w:rFonts w:hint="default" w:ascii="Calibri" w:hAnsi="Calibri" w:cs="Calibri"/>
+                <w:sz w:val="21"/>
+                <w:szCs w:val="21"/>
+              </w:rPr>
+              <w:br w:type="textWrapping"/>
+            </w:r>
+            <w:r>
+              <w:rPr>
+                <w:rFonts w:hint="default" w:ascii="Calibri" w:hAnsi="Calibri" w:cs="Calibri"/>
+                <w:sz w:val="21"/>
+                <w:szCs w:val="21"/>
+                <w:lang w:val="es-MX"/>
+              </w:rPr>
+              <w:t xml:space="preserve">2. </w:t>
+            </w:r>
+            <w:r>
+              <w:rPr>
+                <w:rFonts w:hint="default" w:ascii="Calibri" w:hAnsi="Calibri" w:cs="Calibri"/>
+                <w:sz w:val="21"/>
+                <w:szCs w:val="21"/>
+              </w:rPr>
+              <w:t xml:space="preserve">El sistema despliega la interfaz de búsqueda de ventas. </w:t>
+            </w:r>
+            <w:r>
+              <w:rPr>
+                <w:rFonts w:hint="default" w:ascii="Calibri" w:hAnsi="Calibri" w:cs="Calibri"/>
+                <w:sz w:val="21"/>
+                <w:szCs w:val="21"/>
+              </w:rPr>
+              <w:br w:type="textWrapping"/>
+            </w:r>
+            <w:r>
+              <w:rPr>
+                <w:rFonts w:hint="default" w:ascii="Calibri" w:hAnsi="Calibri" w:cs="Calibri"/>
+                <w:sz w:val="21"/>
+                <w:szCs w:val="21"/>
+                <w:lang w:val="es-MX"/>
+              </w:rPr>
+              <w:t xml:space="preserve">3. </w:t>
+            </w:r>
+            <w:r>
+              <w:rPr>
+                <w:rFonts w:hint="default" w:ascii="Calibri" w:hAnsi="Calibri" w:cs="Calibri"/>
+                <w:sz w:val="21"/>
+                <w:szCs w:val="21"/>
+              </w:rPr>
+              <w:t xml:space="preserve">El actor ingresa uno o más criterios de búsqueda. </w:t>
+            </w:r>
+            <w:r>
+              <w:rPr>
+                <w:rFonts w:hint="default" w:ascii="Calibri" w:hAnsi="Calibri" w:cs="Calibri"/>
+                <w:sz w:val="21"/>
+                <w:szCs w:val="21"/>
+              </w:rPr>
+              <w:br w:type="textWrapping"/>
+            </w:r>
+            <w:r>
+              <w:rPr>
+                <w:rFonts w:hint="default" w:ascii="Calibri" w:hAnsi="Calibri" w:cs="Calibri"/>
+                <w:sz w:val="21"/>
+                <w:szCs w:val="21"/>
+                <w:lang w:val="es-MX"/>
+              </w:rPr>
+              <w:t xml:space="preserve">4. </w:t>
+            </w:r>
+            <w:r>
+              <w:rPr>
+                <w:rFonts w:hint="default" w:ascii="Calibri" w:hAnsi="Calibri" w:cs="Calibri"/>
+                <w:sz w:val="21"/>
+                <w:szCs w:val="21"/>
+              </w:rPr>
+              <w:t xml:space="preserve">El sistema procesa la consulta en la base de datos. </w:t>
+            </w:r>
+            <w:r>
+              <w:rPr>
+                <w:rFonts w:hint="default" w:ascii="Calibri" w:hAnsi="Calibri" w:cs="Calibri"/>
+                <w:sz w:val="21"/>
+                <w:szCs w:val="21"/>
+              </w:rPr>
+              <w:br w:type="textWrapping"/>
+            </w:r>
+            <w:r>
+              <w:rPr>
+                <w:rFonts w:hint="default" w:ascii="Calibri" w:hAnsi="Calibri" w:cs="Calibri"/>
+                <w:sz w:val="21"/>
+                <w:szCs w:val="21"/>
+                <w:lang w:val="es-MX"/>
+              </w:rPr>
+              <w:t xml:space="preserve">5. </w:t>
+            </w:r>
+            <w:r>
+              <w:rPr>
+                <w:rFonts w:hint="default" w:ascii="Calibri" w:hAnsi="Calibri" w:cs="Calibri"/>
+                <w:sz w:val="21"/>
+                <w:szCs w:val="21"/>
+              </w:rPr>
+              <w:t xml:space="preserve">El sistema muestra las ventas encontradas. </w:t>
+            </w:r>
+            <w:r>
+              <w:rPr>
+                <w:rFonts w:hint="default" w:ascii="Calibri" w:hAnsi="Calibri" w:cs="Calibri"/>
+                <w:sz w:val="21"/>
+                <w:szCs w:val="21"/>
+              </w:rPr>
+              <w:br w:type="textWrapping"/>
+            </w:r>
+            <w:r>
+              <w:rPr>
+                <w:rFonts w:hint="default" w:ascii="Calibri" w:hAnsi="Calibri" w:cs="Calibri"/>
+                <w:sz w:val="21"/>
+                <w:szCs w:val="21"/>
+              </w:rPr>
+              <w:br w:type="textWrapping"/>
+            </w:r>
+            <w:r>
+              <w:rPr>
+                <w:rFonts w:hint="default" w:ascii="Calibri" w:hAnsi="Calibri" w:cs="Calibri"/>
+                <w:sz w:val="21"/>
+                <w:szCs w:val="21"/>
+              </w:rPr>
+              <w:br w:type="textWrapping"/>
+            </w:r>
+            <w:bookmarkStart w:id="0" w:name="_GoBack"/>
+            <w:bookmarkEnd w:id="0"/>
+            <w:r>
+              <w:rPr>
+                <w:rFonts w:hint="default" w:ascii="Calibri" w:hAnsi="Calibri" w:cs="Calibri"/>
+                <w:sz w:val="21"/>
+                <w:szCs w:val="21"/>
+              </w:rPr>
+              <w:br w:type="textWrapping"/>
+            </w:r>
+            <w:r>
+              <w:rPr>
+                <w:rFonts w:hint="default" w:ascii="Calibri" w:hAnsi="Calibri" w:cs="Calibri"/>
+                <w:sz w:val="21"/>
+                <w:szCs w:val="21"/>
+              </w:rPr>
+              <w:br w:type="textWrapping"/>
+            </w:r>
+            <w:r>
+              <w:rPr>
+                <w:rFonts w:hint="default" w:ascii="Calibri" w:hAnsi="Calibri" w:cs="Calibri"/>
+                <w:sz w:val="21"/>
+                <w:szCs w:val="21"/>
+              </w:rPr>
+              <w:br w:type="textWrapping"/>
+            </w:r>
+            <w:r>
+              <w:rPr>
+                <w:rFonts w:hint="default" w:ascii="Calibri" w:hAnsi="Calibri" w:cs="Calibri"/>
+                <w:sz w:val="21"/>
+                <w:szCs w:val="21"/>
+                <w:lang w:val="es-MX"/>
+              </w:rPr>
+              <w:t xml:space="preserve">6. </w:t>
+            </w:r>
+            <w:r>
+              <w:rPr>
+                <w:rFonts w:hint="default" w:ascii="Calibri" w:hAnsi="Calibri" w:cs="Calibri"/>
+                <w:sz w:val="21"/>
+                <w:szCs w:val="21"/>
+              </w:rPr>
+              <w:t xml:space="preserve">El actor selecciona una venta específica. </w:t>
+            </w:r>
+            <w:r>
+              <w:rPr>
+                <w:rFonts w:hint="default" w:ascii="Calibri" w:hAnsi="Calibri" w:cs="Calibri"/>
+                <w:sz w:val="21"/>
+                <w:szCs w:val="21"/>
+              </w:rPr>
+              <w:br w:type="textWrapping"/>
+            </w:r>
+            <w:r>
+              <w:rPr>
+                <w:rFonts w:hint="default" w:ascii="Calibri" w:hAnsi="Calibri" w:cs="Calibri"/>
+                <w:sz w:val="21"/>
+                <w:szCs w:val="21"/>
+                <w:lang w:val="es-MX"/>
+              </w:rPr>
+              <w:t xml:space="preserve">7. </w:t>
+            </w:r>
+            <w:r>
+              <w:rPr>
+                <w:rFonts w:hint="default" w:ascii="Calibri" w:hAnsi="Calibri" w:cs="Calibri"/>
+                <w:sz w:val="21"/>
+                <w:szCs w:val="21"/>
+              </w:rPr>
+              <w:t xml:space="preserve">El sistema expone el detalle completo de la venta. </w:t>
+            </w:r>
+            <w:r>
+              <w:rPr>
+                <w:rFonts w:hint="default" w:ascii="Calibri" w:hAnsi="Calibri" w:cs="Calibri"/>
+                <w:sz w:val="21"/>
+                <w:szCs w:val="21"/>
+              </w:rPr>
+              <w:br w:type="textWrapping"/>
+            </w:r>
+            <w:r>
+              <w:rPr>
+                <w:rFonts w:hint="default" w:ascii="Calibri" w:hAnsi="Calibri" w:cs="Calibri"/>
+                <w:sz w:val="21"/>
+                <w:szCs w:val="21"/>
+                <w:lang w:val="es-MX"/>
+              </w:rPr>
+              <w:t xml:space="preserve">8. </w:t>
+            </w:r>
+            <w:r>
+              <w:rPr>
+                <w:rFonts w:hint="default" w:ascii="Calibri" w:hAnsi="Calibri" w:cs="Calibri"/>
+                <w:sz w:val="21"/>
+                <w:szCs w:val="21"/>
+              </w:rPr>
+              <w:t>Fin del UC.</w:t>
+            </w:r>
           </w:p>
           <w:p>
             <w:pPr>
               <w:widowControl w:val="0"/>
               <w:spacing w:after="0" w:line="240" w:lineRule="auto"/>
               <w:rPr>
-                <w:rFonts w:hint="default"/>
-              </w:rPr>
-            </w:pPr>
-            <w:r>
-              <w:rPr>
-                <w:rFonts w:hint="default"/>
-              </w:rPr>
-              <w:t>1. El UC comienza cuando el encargado selecciona la opción “Administrar stock”.</w:t>
-            </w:r>
-          </w:p>
-          <w:p>
-            <w:pPr>
-              <w:widowControl w:val="0"/>
-              <w:spacing w:after="0" w:line="240" w:lineRule="auto"/>
-              <w:rPr>
-                <w:rFonts w:hint="default"/>
-              </w:rPr>
-            </w:pPr>
-            <w:r>
-              <w:rPr>
-                <w:rFonts w:hint="default"/>
-              </w:rPr>
-              <w:t>2. El sistema muestra los productos disponibles.</w:t>
-            </w:r>
-          </w:p>
-          <w:p>
-            <w:pPr>
-              <w:widowControl w:val="0"/>
-              <w:spacing w:after="0" w:line="240" w:lineRule="auto"/>
-              <w:rPr>
-                <w:rFonts w:hint="default"/>
-              </w:rPr>
-            </w:pPr>
-            <w:r>
-              <w:rPr>
-                <w:rFonts w:hint="default"/>
-              </w:rPr>
-              <w:t>3. El encargado selecciona una acción (ingreso, actualización o consulta).</w:t>
-            </w:r>
-          </w:p>
-          <w:p>
-            <w:pPr>
-              <w:widowControl w:val="0"/>
-              <w:spacing w:after="0" w:line="240" w:lineRule="auto"/>
-              <w:rPr>
-                <w:rFonts w:hint="default"/>
-              </w:rPr>
-            </w:pPr>
-          </w:p>
-          <w:p>
-            <w:pPr>
-              <w:widowControl w:val="0"/>
-              <w:spacing w:after="0" w:line="240" w:lineRule="auto"/>
-              <w:rPr>
-                <w:rFonts w:hint="default"/>
-              </w:rPr>
-            </w:pPr>
-          </w:p>
-          <w:p>
-            <w:pPr>
-              <w:widowControl w:val="0"/>
-              <w:spacing w:after="0" w:line="240" w:lineRule="auto"/>
-              <w:rPr>
-                <w:rFonts w:hint="default"/>
-              </w:rPr>
-            </w:pPr>
-            <w:r>
-              <w:rPr>
-                <w:rFonts w:hint="default"/>
-              </w:rPr>
-              <w:t>4. El encargado registra el ingreso de mercadería.</w:t>
-            </w:r>
-          </w:p>
-          <w:p>
-            <w:pPr>
-              <w:widowControl w:val="0"/>
-              <w:spacing w:after="0" w:line="240" w:lineRule="auto"/>
-              <w:rPr>
-                <w:rFonts w:hint="default"/>
-              </w:rPr>
-            </w:pPr>
-            <w:r>
-              <w:rPr>
-                <w:rFonts w:hint="default"/>
-              </w:rPr>
-              <w:t>5. El sistema actualiza el stock.</w:t>
-            </w:r>
-          </w:p>
-          <w:p>
-            <w:pPr>
-              <w:widowControl w:val="0"/>
-              <w:spacing w:after="0" w:line="240" w:lineRule="auto"/>
-              <w:rPr>
-                <w:rFonts w:hint="default"/>
-              </w:rPr>
-            </w:pPr>
-          </w:p>
-          <w:p>
-            <w:pPr>
-              <w:widowControl w:val="0"/>
-              <w:spacing w:after="0" w:line="240" w:lineRule="auto"/>
-              <w:rPr>
-                <w:rFonts w:hint="default"/>
-              </w:rPr>
-            </w:pPr>
-          </w:p>
-          <w:p>
-            <w:pPr>
-              <w:widowControl w:val="0"/>
-              <w:spacing w:after="0" w:line="240" w:lineRule="auto"/>
-              <w:rPr>
-                <w:rFonts w:hint="default"/>
-              </w:rPr>
-            </w:pPr>
-            <w:r>
-              <w:rPr>
-                <w:rFonts w:hint="default"/>
-              </w:rPr>
-              <w:t>6. El sistema registra el movimiento en el histórico.</w:t>
-            </w:r>
-          </w:p>
-          <w:p>
-            <w:pPr>
-              <w:widowControl w:val="0"/>
-              <w:spacing w:after="0" w:line="240" w:lineRule="auto"/>
-              <w:rPr>
-                <w:rFonts w:hint="default"/>
-              </w:rPr>
-            </w:pPr>
-            <w:r>
-              <w:rPr>
-                <w:rFonts w:hint="default"/>
-              </w:rPr>
-              <w:t>7. El encargado consulta el stock actual.</w:t>
-            </w:r>
-          </w:p>
-          <w:p>
-            <w:pPr>
-              <w:widowControl w:val="0"/>
-              <w:spacing w:after="0" w:line="240" w:lineRule="auto"/>
-              <w:rPr>
-                <w:rFonts w:hint="default"/>
-              </w:rPr>
-            </w:pPr>
-            <w:r>
-              <w:rPr>
-                <w:rFonts w:hint="default"/>
-              </w:rPr>
-              <w:t>8. El encargado consulta el histórico de movimientos.</w:t>
-            </w:r>
-          </w:p>
-          <w:p>
-            <w:pPr>
-              <w:widowControl w:val="0"/>
-              <w:spacing w:after="0" w:line="240" w:lineRule="auto"/>
-            </w:pPr>
-            <w:r>
-              <w:rPr>
-                <w:rFonts w:hint="default"/>
-              </w:rPr>
-              <w:t>9. Fin del UC.</w:t>
-            </w:r>
+                <w:rFonts w:hint="default" w:ascii="Calibri" w:hAnsi="Calibri" w:cs="Calibri"/>
+                <w:sz w:val="21"/>
+                <w:szCs w:val="21"/>
+              </w:rPr>
+            </w:pPr>
           </w:p>
         </w:tc>
         <w:tc>
@@ -1448,6 +1830,11 @@
             <w:pPr>
               <w:widowControl w:val="0"/>
               <w:spacing w:after="0"/>
+              <w:rPr>
+                <w:rFonts w:hint="default" w:ascii="Calibri" w:hAnsi="Calibri" w:cs="Calibri"/>
+                <w:sz w:val="21"/>
+                <w:szCs w:val="21"/>
+              </w:rPr>
             </w:pPr>
           </w:p>
           <w:p>
@@ -1455,6 +1842,11 @@
               <w:widowControl w:val="0"/>
               <w:spacing w:after="0"/>
               <w:jc w:val="both"/>
+              <w:rPr>
+                <w:rFonts w:hint="default" w:ascii="Calibri" w:hAnsi="Calibri" w:cs="Calibri"/>
+                <w:sz w:val="21"/>
+                <w:szCs w:val="21"/>
+              </w:rPr>
             </w:pPr>
           </w:p>
           <w:p>
@@ -1462,6 +1854,11 @@
               <w:widowControl w:val="0"/>
               <w:spacing w:after="0"/>
               <w:jc w:val="both"/>
+              <w:rPr>
+                <w:rFonts w:hint="default" w:ascii="Calibri" w:hAnsi="Calibri" w:cs="Calibri"/>
+                <w:sz w:val="21"/>
+                <w:szCs w:val="21"/>
+              </w:rPr>
             </w:pPr>
           </w:p>
           <w:p>
@@ -1472,7 +1869,9 @@
               <w:ind w:left="0"/>
               <w:jc w:val="both"/>
               <w:rPr>
-                <w:rFonts w:hint="default"/>
+                <w:rFonts w:hint="default" w:ascii="Calibri" w:hAnsi="Calibri" w:eastAsia="SimSun" w:cs="Calibri"/>
+                <w:sz w:val="21"/>
+                <w:szCs w:val="21"/>
               </w:rPr>
             </w:pPr>
           </w:p>
@@ -1484,15 +1883,11 @@
               <w:ind w:left="0"/>
               <w:jc w:val="both"/>
               <w:rPr>
-                <w:rFonts w:hint="default"/>
-              </w:rPr>
-            </w:pPr>
-            <w:r>
-              <w:rPr>
-                <w:rFonts w:hint="default"/>
-              </w:rPr>
-              <w:t>3.1 El encargado cancela la operación.</w:t>
-            </w:r>
+                <w:rFonts w:hint="default" w:ascii="Calibri" w:hAnsi="Calibri" w:eastAsia="SimSun" w:cs="Calibri"/>
+                <w:sz w:val="21"/>
+                <w:szCs w:val="21"/>
+              </w:rPr>
+            </w:pPr>
           </w:p>
           <w:p>
             <w:pPr>
@@ -1502,15 +1897,11 @@
               <w:ind w:left="0"/>
               <w:jc w:val="both"/>
               <w:rPr>
-                <w:rFonts w:hint="default"/>
-              </w:rPr>
-            </w:pPr>
-            <w:r>
-              <w:rPr>
-                <w:rFonts w:hint="default"/>
-              </w:rPr>
-              <w:t>3.2 No se realizan cambios.</w:t>
-            </w:r>
+                <w:rFonts w:hint="default" w:ascii="Calibri" w:hAnsi="Calibri" w:eastAsia="SimSun" w:cs="Calibri"/>
+                <w:sz w:val="21"/>
+                <w:szCs w:val="21"/>
+              </w:rPr>
+            </w:pPr>
           </w:p>
           <w:p>
             <w:pPr>
@@ -1519,13 +1910,12 @@
               <w:spacing w:after="0" w:line="240" w:lineRule="auto"/>
               <w:ind w:left="0"/>
               <w:jc w:val="both"/>
-            </w:pPr>
-            <w:r>
-              <w:rPr>
-                <w:rFonts w:hint="default"/>
-              </w:rPr>
-              <w:t>3.3 Fin del UC.</w:t>
-            </w:r>
+              <w:rPr>
+                <w:rFonts w:hint="default" w:ascii="Calibri" w:hAnsi="Calibri" w:eastAsia="SimSun" w:cs="Calibri"/>
+                <w:sz w:val="21"/>
+                <w:szCs w:val="21"/>
+              </w:rPr>
+            </w:pPr>
           </w:p>
           <w:p>
             <w:pPr>
@@ -1534,7 +1924,60 @@
               <w:spacing w:after="0" w:line="240" w:lineRule="auto"/>
               <w:ind w:left="0"/>
               <w:jc w:val="both"/>
-            </w:pPr>
+              <w:rPr>
+                <w:rFonts w:hint="default" w:ascii="Calibri" w:hAnsi="Calibri" w:cs="Calibri"/>
+                <w:sz w:val="21"/>
+                <w:szCs w:val="21"/>
+              </w:rPr>
+            </w:pPr>
+            <w:r>
+              <w:rPr>
+                <w:rFonts w:hint="default" w:ascii="Calibri" w:hAnsi="Calibri" w:eastAsia="SimSun" w:cs="Calibri"/>
+                <w:sz w:val="21"/>
+                <w:szCs w:val="21"/>
+              </w:rPr>
+              <w:br w:type="textWrapping"/>
+            </w:r>
+            <w:r>
+              <w:rPr>
+                <w:rFonts w:hint="default" w:ascii="Calibri" w:hAnsi="Calibri" w:eastAsia="SimSun" w:cs="Calibri"/>
+                <w:sz w:val="21"/>
+                <w:szCs w:val="21"/>
+              </w:rPr>
+              <w:t>5.1 El sistema no encuentra coincidencias.</w:t>
+            </w:r>
+            <w:r>
+              <w:rPr>
+                <w:rFonts w:hint="default" w:ascii="Calibri" w:hAnsi="Calibri" w:eastAsia="SimSun" w:cs="Calibri"/>
+                <w:sz w:val="21"/>
+                <w:szCs w:val="21"/>
+              </w:rPr>
+              <w:br w:type="textWrapping"/>
+            </w:r>
+            <w:r>
+              <w:rPr>
+                <w:rFonts w:hint="default" w:ascii="Calibri" w:hAnsi="Calibri" w:eastAsia="SimSun" w:cs="Calibri"/>
+                <w:sz w:val="21"/>
+                <w:szCs w:val="21"/>
+              </w:rPr>
+              <w:t>5.1.1 El sistema informa que no existen resultados para la búsqueda realizada.</w:t>
+            </w:r>
+            <w:r>
+              <w:rPr>
+                <w:rFonts w:hint="default" w:ascii="Calibri" w:hAnsi="Calibri" w:eastAsia="SimSun" w:cs="Calibri"/>
+                <w:sz w:val="21"/>
+                <w:szCs w:val="21"/>
+              </w:rPr>
+              <w:br w:type="textWrapping"/>
+            </w:r>
+            <w:r>
+              <w:rPr>
+                <w:rFonts w:hint="default" w:ascii="Calibri" w:hAnsi="Calibri" w:eastAsia="SimSun" w:cs="Calibri"/>
+                <w:sz w:val="21"/>
+                <w:szCs w:val="21"/>
+              </w:rPr>
+              <w:t>5.1.2 Fin del UC.</w:t>
+            </w:r>
           </w:p>
           <w:p>
             <w:pPr>
@@ -1544,7 +1987,9 @@
               <w:ind w:left="0"/>
               <w:jc w:val="both"/>
               <w:rPr>
-                <w:rFonts w:hint="default"/>
+                <w:rFonts w:hint="default" w:ascii="Calibri" w:hAnsi="Calibri" w:cs="Calibri"/>
+                <w:sz w:val="21"/>
+                <w:szCs w:val="21"/>
               </w:rPr>
             </w:pPr>
           </w:p>
@@ -1556,91 +2001,9 @@
               <w:ind w:left="0"/>
               <w:jc w:val="both"/>
               <w:rPr>
-                <w:rFonts w:hint="default"/>
-              </w:rPr>
-            </w:pPr>
-            <w:r>
-              <w:rPr>
-                <w:rFonts w:hint="default"/>
-              </w:rPr>
-              <w:t>5.1 El sistema informa un error.</w:t>
-            </w:r>
-          </w:p>
-          <w:p>
-            <w:pPr>
-              <w:pStyle w:val="16"/>
-              <w:widowControl w:val="0"/>
-              <w:spacing w:after="0" w:line="240" w:lineRule="auto"/>
-              <w:ind w:left="0"/>
-              <w:jc w:val="both"/>
-              <w:rPr>
-                <w:rFonts w:hint="default"/>
-              </w:rPr>
-            </w:pPr>
-            <w:r>
-              <w:rPr>
-                <w:rFonts w:hint="default"/>
-              </w:rPr>
-              <w:t>5.2 No se actualiza el stock.</w:t>
-            </w:r>
-          </w:p>
-          <w:p>
-            <w:pPr>
-              <w:pStyle w:val="16"/>
-              <w:widowControl w:val="0"/>
-              <w:spacing w:after="0" w:line="240" w:lineRule="auto"/>
-              <w:ind w:left="0"/>
-              <w:jc w:val="both"/>
-              <w:rPr>
-                <w:rFonts w:hint="default"/>
-              </w:rPr>
-            </w:pPr>
-          </w:p>
-          <w:p>
-            <w:pPr>
-              <w:pStyle w:val="16"/>
-              <w:widowControl w:val="0"/>
-              <w:spacing w:after="0" w:line="240" w:lineRule="auto"/>
-              <w:ind w:left="0"/>
-              <w:jc w:val="both"/>
-              <w:rPr>
-                <w:rFonts w:hint="default"/>
-              </w:rPr>
-            </w:pPr>
-          </w:p>
-          <w:p>
-            <w:pPr>
-              <w:pStyle w:val="16"/>
-              <w:widowControl w:val="0"/>
-              <w:spacing w:after="0" w:line="240" w:lineRule="auto"/>
-              <w:ind w:left="0"/>
-              <w:jc w:val="both"/>
-              <w:rPr>
-                <w:rFonts w:hint="default"/>
-              </w:rPr>
-            </w:pPr>
-          </w:p>
-          <w:p>
-            <w:pPr>
-              <w:pStyle w:val="16"/>
-              <w:widowControl w:val="0"/>
-              <w:spacing w:after="0" w:line="240" w:lineRule="auto"/>
-              <w:ind w:left="0"/>
-              <w:jc w:val="both"/>
-              <w:rPr>
-                <w:rFonts w:hint="default"/>
-              </w:rPr>
-            </w:pPr>
-          </w:p>
-          <w:p>
-            <w:pPr>
-              <w:pStyle w:val="16"/>
-              <w:widowControl w:val="0"/>
-              <w:spacing w:after="0" w:line="240" w:lineRule="auto"/>
-              <w:ind w:left="0"/>
-              <w:jc w:val="both"/>
-              <w:rPr>
-                <w:rFonts w:hint="default"/>
+                <w:rFonts w:hint="default" w:ascii="Calibri" w:hAnsi="Calibri" w:cs="Calibri"/>
+                <w:sz w:val="21"/>
+                <w:szCs w:val="21"/>
               </w:rPr>
             </w:pPr>
           </w:p>
@@ -1670,19 +2033,29 @@
             <w:pPr>
               <w:widowControl w:val="0"/>
               <w:spacing w:after="0"/>
-            </w:pPr>
-            <w:r>
+              <w:rPr>
+                <w:rFonts w:hint="default" w:ascii="Calibri" w:hAnsi="Calibri" w:cs="Calibri"/>
+                <w:sz w:val="21"/>
+                <w:szCs w:val="21"/>
+                <w:lang w:val="es-MX"/>
+              </w:rPr>
+            </w:pPr>
+            <w:r>
+              <w:rPr>
+                <w:rFonts w:hint="default" w:ascii="Calibri" w:hAnsi="Calibri" w:cs="Calibri"/>
+                <w:sz w:val="21"/>
+                <w:szCs w:val="21"/>
+              </w:rPr>
               <w:t xml:space="preserve">Asociaciones de extensión: </w:t>
             </w:r>
             <w:r>
               <w:rPr>
-                <w:rFonts w:hint="default"/>
+                <w:rFonts w:hint="default" w:ascii="Calibri" w:hAnsi="Calibri" w:cs="Calibri"/>
+                <w:sz w:val="21"/>
+                <w:szCs w:val="21"/>
                 <w:lang w:val="es-MX"/>
               </w:rPr>
-              <w:t>N</w:t>
-            </w:r>
-            <w:r>
-              <w:t>o aplica</w:t>
+              <w:t>Emitir factura - Emitir nota de crédito</w:t>
             </w:r>
           </w:p>
         </w:tc>
@@ -1712,57 +2085,28 @@
               <w:widowControl w:val="0"/>
               <w:spacing w:after="0"/>
               <w:rPr>
-                <w:rFonts w:hint="default"/>
+                <w:rFonts w:hint="default" w:ascii="Calibri" w:hAnsi="Calibri" w:cs="Calibri"/>
+                <w:sz w:val="21"/>
+                <w:szCs w:val="21"/>
                 <w:lang w:val="es-MX"/>
               </w:rPr>
             </w:pPr>
             <w:r>
+              <w:rPr>
+                <w:rFonts w:hint="default" w:ascii="Calibri" w:hAnsi="Calibri" w:cs="Calibri"/>
+                <w:sz w:val="21"/>
+                <w:szCs w:val="21"/>
+              </w:rPr>
               <w:t xml:space="preserve">Asociaciones de inclusión: </w:t>
             </w:r>
             <w:r>
               <w:rPr>
-                <w:rFonts w:hint="default"/>
-              </w:rPr>
-              <w:t>Registrar ingreso de mercadería</w:t>
-            </w:r>
-            <w:r>
-              <w:rPr>
-                <w:rFonts w:hint="default"/>
+                <w:rFonts w:hint="default" w:ascii="Calibri" w:hAnsi="Calibri" w:cs="Calibri"/>
+                <w:sz w:val="21"/>
+                <w:szCs w:val="21"/>
                 <w:lang w:val="es-MX"/>
               </w:rPr>
-              <w:t xml:space="preserve">, </w:t>
-            </w:r>
-            <w:r>
-              <w:rPr>
-                <w:rFonts w:hint="default"/>
-              </w:rPr>
-              <w:t>Actualizar stock</w:t>
-            </w:r>
-            <w:r>
-              <w:rPr>
-                <w:rFonts w:hint="default"/>
-                <w:lang w:val="es-MX"/>
-              </w:rPr>
-              <w:t xml:space="preserve">, </w:t>
-            </w:r>
-            <w:r>
-              <w:rPr>
-                <w:rFonts w:hint="default"/>
-              </w:rPr>
-              <w:t>Consultar stock</w:t>
-            </w:r>
-            <w:r>
-              <w:rPr>
-                <w:rFonts w:hint="default"/>
-                <w:lang w:val="es-MX"/>
-              </w:rPr>
-              <w:t xml:space="preserve"> y </w:t>
-            </w:r>
-            <w:r>
-              <w:rPr>
-                <w:rFonts w:hint="default"/>
-              </w:rPr>
-              <w:t>Consultar histórico de stock</w:t>
+              <w:t>No aplica</w:t>
             </w:r>
           </w:p>
         </w:tc>
@@ -1791,18 +2135,35 @@
             <w:pPr>
               <w:widowControl w:val="0"/>
               <w:spacing w:after="0"/>
-            </w:pPr>
-            <w:r>
+              <w:rPr>
+                <w:rFonts w:hint="default" w:ascii="Calibri" w:hAnsi="Calibri" w:cs="Calibri"/>
+                <w:sz w:val="21"/>
+                <w:szCs w:val="21"/>
+              </w:rPr>
+            </w:pPr>
+            <w:r>
+              <w:rPr>
+                <w:rFonts w:hint="default" w:ascii="Calibri" w:hAnsi="Calibri" w:cs="Calibri"/>
+                <w:sz w:val="21"/>
+                <w:szCs w:val="21"/>
+              </w:rPr>
               <w:t xml:space="preserve">Use case donde se incluye: </w:t>
             </w:r>
             <w:r>
               <w:rPr>
-                <w:rFonts w:hint="default"/>
+                <w:rFonts w:hint="default" w:ascii="Calibri" w:hAnsi="Calibri" w:cs="Calibri"/>
+                <w:sz w:val="21"/>
+                <w:szCs w:val="21"/>
                 <w:lang w:val="es-MX"/>
               </w:rPr>
               <w:t>N</w:t>
             </w:r>
             <w:r>
+              <w:rPr>
+                <w:rFonts w:hint="default" w:ascii="Calibri" w:hAnsi="Calibri" w:cs="Calibri"/>
+                <w:sz w:val="21"/>
+                <w:szCs w:val="21"/>
+              </w:rPr>
               <w:t>o aplica</w:t>
             </w:r>
           </w:p>
@@ -1832,18 +2193,35 @@
             <w:pPr>
               <w:widowControl w:val="0"/>
               <w:spacing w:after="0"/>
-            </w:pPr>
-            <w:r>
+              <w:rPr>
+                <w:rFonts w:hint="default" w:ascii="Calibri" w:hAnsi="Calibri" w:cs="Calibri"/>
+                <w:sz w:val="21"/>
+                <w:szCs w:val="21"/>
+              </w:rPr>
+            </w:pPr>
+            <w:r>
+              <w:rPr>
+                <w:rFonts w:hint="default" w:ascii="Calibri" w:hAnsi="Calibri" w:cs="Calibri"/>
+                <w:sz w:val="21"/>
+                <w:szCs w:val="21"/>
+              </w:rPr>
               <w:t xml:space="preserve">Use case al que extiende: </w:t>
             </w:r>
             <w:r>
               <w:rPr>
-                <w:rFonts w:hint="default"/>
+                <w:rFonts w:hint="default" w:ascii="Calibri" w:hAnsi="Calibri" w:cs="Calibri"/>
+                <w:sz w:val="21"/>
+                <w:szCs w:val="21"/>
                 <w:lang w:val="es-MX"/>
               </w:rPr>
               <w:t>N</w:t>
             </w:r>
             <w:r>
+              <w:rPr>
+                <w:rFonts w:hint="default" w:ascii="Calibri" w:hAnsi="Calibri" w:cs="Calibri"/>
+                <w:sz w:val="21"/>
+                <w:szCs w:val="21"/>
+              </w:rPr>
               <w:t>o aplica</w:t>
             </w:r>
           </w:p>
@@ -1873,18 +2251,35 @@
             <w:pPr>
               <w:widowControl w:val="0"/>
               <w:spacing w:after="0"/>
-            </w:pPr>
-            <w:r>
+              <w:rPr>
+                <w:rFonts w:hint="default" w:ascii="Calibri" w:hAnsi="Calibri" w:cs="Calibri"/>
+                <w:sz w:val="21"/>
+                <w:szCs w:val="21"/>
+              </w:rPr>
+            </w:pPr>
+            <w:r>
+              <w:rPr>
+                <w:rFonts w:hint="default" w:ascii="Calibri" w:hAnsi="Calibri" w:cs="Calibri"/>
+                <w:sz w:val="21"/>
+                <w:szCs w:val="21"/>
+              </w:rPr>
               <w:t xml:space="preserve">Use case de generalización: </w:t>
             </w:r>
             <w:r>
               <w:rPr>
-                <w:rFonts w:hint="default"/>
+                <w:rFonts w:hint="default" w:ascii="Calibri" w:hAnsi="Calibri" w:cs="Calibri"/>
+                <w:sz w:val="21"/>
+                <w:szCs w:val="21"/>
                 <w:lang w:val="es-MX"/>
               </w:rPr>
               <w:t>N</w:t>
             </w:r>
             <w:r>
+              <w:rPr>
+                <w:rFonts w:hint="default" w:ascii="Calibri" w:hAnsi="Calibri" w:cs="Calibri"/>
+                <w:sz w:val="21"/>
+                <w:szCs w:val="21"/>
+              </w:rPr>
               <w:t>o aplica</w:t>
             </w:r>
           </w:p>
@@ -1956,6 +2351,26 @@
     </w:p>
   </w:footnote>
 </w:footnotes>
+</file>
+
+<file path=word/numbering.xml><?xml version="1.0" encoding="utf-8"?>
+<w:numbering xmlns:wpc="http://schemas.microsoft.com/office/word/2010/wordprocessingCanvas" xmlns:mc="http://schemas.openxmlformats.org/markup-compatibility/2006" xmlns:o="urn:schemas-microsoft-com:office:office" xmlns:r="http://schemas.openxmlformats.org/officeDocument/2006/relationships" xmlns:m="http://schemas.openxmlformats.org/officeDocument/2006/math" xmlns:v="urn:schemas-microsoft-com:vml" xmlns:wp14="http://schemas.microsoft.com/office/word/2010/wordprocessingDrawing" xmlns:wp="http://schemas.openxmlformats.org/drawingml/2006/wordprocessingDrawing" xmlns:w10="urn:schemas-microsoft-com:office:word" xmlns:w="http://schemas.openxmlformats.org/wordprocessingml/2006/main" xmlns:w14="http://schemas.microsoft.com/office/word/2010/wordml" xmlns:wpg="http://schemas.microsoft.com/office/word/2010/wordprocessingGroup" xmlns:wpi="http://schemas.microsoft.com/office/word/2010/wordprocessingInk" xmlns:wne="http://schemas.microsoft.com/office/word/2006/wordml" xmlns:wps="http://schemas.microsoft.com/office/word/2010/wordprocessingShape" xmlns:wpsCustomData="http://www.wps.cn/officeDocument/2013/wpsCustomData" mc:Ignorable="w14 wp14">
+  <w:abstractNum w:abstractNumId="0">
+    <w:nsid w:val="5F037C71"/>
+    <w:multiLevelType w:val="singleLevel"/>
+    <w:tmpl w:val="5F037C71"/>
+    <w:lvl w:ilvl="0" w:tentative="0">
+      <w:start w:val="1"/>
+      <w:numFmt w:val="decimal"/>
+      <w:suff w:val="space"/>
+      <w:lvlText w:val="%1."/>
+      <w:lvlJc w:val="left"/>
+    </w:lvl>
+  </w:abstractNum>
+  <w:num w:numId="1">
+    <w:abstractNumId w:val="0"/>
+  </w:num>
+</w:numbering>
 </file>
 
 <file path=word/styles.xml><?xml version="1.0" encoding="utf-8"?>
@@ -2448,21 +2863,6 @@
 </file>
 
 <file path=customXml/item2.xml><?xml version="1.0" encoding="utf-8"?>
-<p:properties xmlns:p="http://schemas.microsoft.com/office/2006/metadata/properties" xmlns:xsi="http://www.w3.org/2001/XMLSchema-instance" xmlns:pc="http://schemas.microsoft.com/office/infopath/2007/PartnerControls">
-  <documentManagement/>
-</p:properties>
-</file>
-
-<file path=customXml/item3.xml><?xml version="1.0" encoding="utf-8"?>
-<?mso-contentType ?>
-<FormTemplates xmlns="http://schemas.microsoft.com/sharepoint/v3/contenttype/forms">
-  <Display>DocumentLibraryForm</Display>
-  <Edit>DocumentLibraryForm</Edit>
-  <New>DocumentLibraryForm</New>
-</FormTemplates>
-</file>
-
-<file path=customXml/item4.xml><?xml version="1.0" encoding="utf-8"?>
 <ct:contentTypeSchema xmlns:ct="http://schemas.microsoft.com/office/2006/metadata/contentType" xmlns:ma="http://schemas.microsoft.com/office/2006/metadata/properties/metaAttributes" ct:_="" ma:_="" ma:contentTypeName="Documento" ma:contentTypeID="0x0101002E0A30BDBBD87047A4A56B849D40EE3A" ma:contentTypeVersion="0" ma:contentTypeDescription="Crear nuevo documento." ma:contentTypeScope="" ma:versionID="29e618272a5e25c2a03f54d0b20982da">
   <xsd:schema xmlns:xsd="http://www.w3.org/2001/XMLSchema" xmlns:xs="http://www.w3.org/2001/XMLSchema" xmlns:p="http://schemas.microsoft.com/office/2006/metadata/properties" targetNamespace="http://schemas.microsoft.com/office/2006/metadata/properties" ma:root="true" ma:fieldsID="6f811a6767019e7426d133b423302158">
     <xsd:element name="properties">
@@ -2576,6 +2976,21 @@
 </ct:contentTypeSchema>
 </file>
 
+<file path=customXml/item3.xml><?xml version="1.0" encoding="utf-8"?>
+<?mso-contentType ?>
+<FormTemplates xmlns="http://schemas.microsoft.com/sharepoint/v3/contenttype/forms">
+  <Display>DocumentLibraryForm</Display>
+  <Edit>DocumentLibraryForm</Edit>
+  <New>DocumentLibraryForm</New>
+</FormTemplates>
+</file>
+
+<file path=customXml/item4.xml><?xml version="1.0" encoding="utf-8"?>
+<p:properties xmlns:p="http://schemas.microsoft.com/office/2006/metadata/properties" xmlns:xsi="http://www.w3.org/2001/XMLSchema-instance" xmlns:pc="http://schemas.microsoft.com/office/infopath/2007/PartnerControls">
+  <documentManagement/>
+</p:properties>
+</file>
+
 <file path=customXml/itemProps1.xml><?xml version="1.0" encoding="utf-8"?>
 <ds:datastoreItem xmlns:ds="http://schemas.openxmlformats.org/officeDocument/2006/customXml" ds:itemID="{B1977F7D-205B-4081-913C-38D41E755F92}">
   <ds:schemaRefs>
@@ -2585,7 +3000,7 @@
 </file>
 
 <file path=customXml/itemProps2.xml><?xml version="1.0" encoding="utf-8"?>
-<ds:datastoreItem xmlns:ds="http://schemas.openxmlformats.org/officeDocument/2006/customXml" ds:itemID="{3235D19B-92AA-40D1-A250-F0977FEF6321}">
+<ds:datastoreItem xmlns:ds="http://schemas.openxmlformats.org/officeDocument/2006/customXml" ds:itemID="{CD15B3DF-7EC2-4C1E-984B-BE8A2354B205}">
   <ds:schemaRefs/>
 </ds:datastoreItem>
 </file>
@@ -2597,7 +3012,7 @@
 </file>
 
 <file path=customXml/itemProps4.xml><?xml version="1.0" encoding="utf-8"?>
-<ds:datastoreItem xmlns:ds="http://schemas.openxmlformats.org/officeDocument/2006/customXml" ds:itemID="{CD15B3DF-7EC2-4C1E-984B-BE8A2354B205}">
+<ds:datastoreItem xmlns:ds="http://schemas.openxmlformats.org/officeDocument/2006/customXml" ds:itemID="{3235D19B-92AA-40D1-A250-F0977FEF6321}">
   <ds:schemaRefs/>
 </ds:datastoreItem>
 </file>
</xml_diff>